<commit_message>
docs: fix table of contents layout in appendix A, rebuild submission PDF and zip
</commit_message>
<xml_diff>
--- a/docs/coursework/Приложение_А_Техническое_задание.docx
+++ b/docs/coursework/Приложение_А_Техническое_задание.docx
@@ -312,8 +312,13 @@
       <w:pPr>
         <w:pStyle w:val="21"/>
         <w:tabs>
-          <w:tab w:val="left" w:pos="1440"/>
-        </w:tabs>
+          <w:tab w:val="clear" w:pos="9911"/>
+          <w:tab w:val="clear" w:pos="1100"/>
+          <w:tab w:val="left" w:pos="567"/>
+          <w:tab w:val="right" w:leader="dot" w:pos="8788"/>
+        </w:tabs>
+        <w:ind w:left="0" w:right="0" w:firstLine="0" w:hanging="0"/>
+        <w:jc w:val="left"/>
       </w:pPr>
       <w:r>
         <w:fldChar w:fldCharType="begin"/>
@@ -358,8 +363,13 @@
       <w:pPr>
         <w:pStyle w:val="31"/>
         <w:tabs>
-          <w:tab w:val="left" w:pos="1929"/>
-        </w:tabs>
+          <w:tab w:val="clear" w:pos="9911"/>
+          <w:tab w:val="clear" w:pos="1100"/>
+          <w:tab w:val="left" w:pos="1134"/>
+          <w:tab w:val="right" w:leader="dot" w:pos="8788"/>
+        </w:tabs>
+        <w:ind w:left="284" w:right="0" w:firstLine="0" w:hanging="0"/>
+        <w:jc w:val="left"/>
       </w:pPr>
       <w:hyperlink w:anchor="_Toc000500001" w:history="1">
         <w:r>
@@ -395,8 +405,13 @@
       <w:pPr>
         <w:pStyle w:val="31"/>
         <w:tabs>
-          <w:tab w:val="left" w:pos="1929"/>
-        </w:tabs>
+          <w:tab w:val="clear" w:pos="9911"/>
+          <w:tab w:val="clear" w:pos="1100"/>
+          <w:tab w:val="left" w:pos="1134"/>
+          <w:tab w:val="right" w:leader="dot" w:pos="8788"/>
+        </w:tabs>
+        <w:ind w:left="284" w:right="0" w:firstLine="0" w:hanging="0"/>
+        <w:jc w:val="left"/>
       </w:pPr>
       <w:hyperlink w:anchor="_Toc000500002" w:history="1">
         <w:r>
@@ -432,8 +447,13 @@
       <w:pPr>
         <w:pStyle w:val="21"/>
         <w:tabs>
-          <w:tab w:val="left" w:pos="1440"/>
-        </w:tabs>
+          <w:tab w:val="clear" w:pos="9911"/>
+          <w:tab w:val="clear" w:pos="1100"/>
+          <w:tab w:val="left" w:pos="567"/>
+          <w:tab w:val="right" w:leader="dot" w:pos="8788"/>
+        </w:tabs>
+        <w:ind w:left="0" w:right="0" w:firstLine="0" w:hanging="0"/>
+        <w:jc w:val="left"/>
       </w:pPr>
       <w:hyperlink w:anchor="_Toc000500003" w:history="1">
         <w:r>
@@ -469,8 +489,13 @@
       <w:pPr>
         <w:pStyle w:val="31"/>
         <w:tabs>
-          <w:tab w:val="left" w:pos="1929"/>
-        </w:tabs>
+          <w:tab w:val="clear" w:pos="9911"/>
+          <w:tab w:val="clear" w:pos="1100"/>
+          <w:tab w:val="left" w:pos="1134"/>
+          <w:tab w:val="right" w:leader="dot" w:pos="8788"/>
+        </w:tabs>
+        <w:ind w:left="284" w:right="0" w:firstLine="0" w:hanging="0"/>
+        <w:jc w:val="left"/>
       </w:pPr>
       <w:hyperlink w:anchor="_Toc000500004" w:history="1">
         <w:r>
@@ -506,8 +531,13 @@
       <w:pPr>
         <w:pStyle w:val="31"/>
         <w:tabs>
-          <w:tab w:val="left" w:pos="1929"/>
-        </w:tabs>
+          <w:tab w:val="clear" w:pos="9911"/>
+          <w:tab w:val="clear" w:pos="1100"/>
+          <w:tab w:val="left" w:pos="1134"/>
+          <w:tab w:val="right" w:leader="dot" w:pos="8788"/>
+        </w:tabs>
+        <w:ind w:left="284" w:right="0" w:firstLine="0" w:hanging="0"/>
+        <w:jc w:val="left"/>
       </w:pPr>
       <w:hyperlink w:anchor="_Toc000500005" w:history="1">
         <w:r>
@@ -543,8 +573,13 @@
       <w:pPr>
         <w:pStyle w:val="21"/>
         <w:tabs>
-          <w:tab w:val="left" w:pos="1440"/>
-        </w:tabs>
+          <w:tab w:val="clear" w:pos="9911"/>
+          <w:tab w:val="clear" w:pos="1100"/>
+          <w:tab w:val="left" w:pos="567"/>
+          <w:tab w:val="right" w:leader="dot" w:pos="8788"/>
+        </w:tabs>
+        <w:ind w:left="0" w:right="0" w:firstLine="0" w:hanging="0"/>
+        <w:jc w:val="left"/>
       </w:pPr>
       <w:hyperlink w:anchor="_Toc000500006" w:history="1">
         <w:r>
@@ -580,8 +615,13 @@
       <w:pPr>
         <w:pStyle w:val="31"/>
         <w:tabs>
-          <w:tab w:val="left" w:pos="1929"/>
-        </w:tabs>
+          <w:tab w:val="clear" w:pos="9911"/>
+          <w:tab w:val="clear" w:pos="1100"/>
+          <w:tab w:val="left" w:pos="1134"/>
+          <w:tab w:val="right" w:leader="dot" w:pos="8788"/>
+        </w:tabs>
+        <w:ind w:left="284" w:right="0" w:firstLine="0" w:hanging="0"/>
+        <w:jc w:val="left"/>
       </w:pPr>
       <w:hyperlink w:anchor="_Toc000500007" w:history="1">
         <w:r>
@@ -617,8 +657,13 @@
       <w:pPr>
         <w:pStyle w:val="31"/>
         <w:tabs>
-          <w:tab w:val="left" w:pos="1929"/>
-        </w:tabs>
+          <w:tab w:val="clear" w:pos="9911"/>
+          <w:tab w:val="clear" w:pos="1100"/>
+          <w:tab w:val="left" w:pos="1134"/>
+          <w:tab w:val="right" w:leader="dot" w:pos="8788"/>
+        </w:tabs>
+        <w:ind w:left="284" w:right="0" w:firstLine="0" w:hanging="0"/>
+        <w:jc w:val="left"/>
       </w:pPr>
       <w:hyperlink w:anchor="_Toc000500008" w:history="1">
         <w:r>
@@ -654,8 +699,13 @@
       <w:pPr>
         <w:pStyle w:val="21"/>
         <w:tabs>
-          <w:tab w:val="left" w:pos="1440"/>
-        </w:tabs>
+          <w:tab w:val="clear" w:pos="9911"/>
+          <w:tab w:val="clear" w:pos="1100"/>
+          <w:tab w:val="left" w:pos="567"/>
+          <w:tab w:val="right" w:leader="dot" w:pos="8788"/>
+        </w:tabs>
+        <w:ind w:left="0" w:right="0" w:firstLine="0" w:hanging="0"/>
+        <w:jc w:val="left"/>
       </w:pPr>
       <w:hyperlink w:anchor="_Toc000500009" w:history="1">
         <w:r>
@@ -691,8 +741,13 @@
       <w:pPr>
         <w:pStyle w:val="31"/>
         <w:tabs>
-          <w:tab w:val="left" w:pos="1929"/>
-        </w:tabs>
+          <w:tab w:val="clear" w:pos="9911"/>
+          <w:tab w:val="clear" w:pos="1100"/>
+          <w:tab w:val="left" w:pos="1134"/>
+          <w:tab w:val="right" w:leader="dot" w:pos="8788"/>
+        </w:tabs>
+        <w:ind w:left="284" w:right="0" w:firstLine="0" w:hanging="0"/>
+        <w:jc w:val="left"/>
       </w:pPr>
       <w:hyperlink w:anchor="_Toc000500010" w:history="1">
         <w:r>
@@ -728,8 +783,13 @@
       <w:pPr>
         <w:pStyle w:val="31"/>
         <w:tabs>
-          <w:tab w:val="left" w:pos="1929"/>
-        </w:tabs>
+          <w:tab w:val="clear" w:pos="9911"/>
+          <w:tab w:val="clear" w:pos="1100"/>
+          <w:tab w:val="left" w:pos="1134"/>
+          <w:tab w:val="right" w:leader="dot" w:pos="8788"/>
+        </w:tabs>
+        <w:ind w:left="284" w:right="0" w:firstLine="0" w:hanging="0"/>
+        <w:jc w:val="left"/>
       </w:pPr>
       <w:hyperlink w:anchor="_Toc000500011" w:history="1">
         <w:r>
@@ -765,8 +825,13 @@
       <w:pPr>
         <w:pStyle w:val="31"/>
         <w:tabs>
-          <w:tab w:val="left" w:pos="1929"/>
-        </w:tabs>
+          <w:tab w:val="clear" w:pos="9911"/>
+          <w:tab w:val="clear" w:pos="1100"/>
+          <w:tab w:val="left" w:pos="1134"/>
+          <w:tab w:val="right" w:leader="dot" w:pos="8788"/>
+        </w:tabs>
+        <w:ind w:left="284" w:right="0" w:firstLine="0" w:hanging="0"/>
+        <w:jc w:val="left"/>
       </w:pPr>
       <w:hyperlink w:anchor="_Toc000500012" w:history="1">
         <w:r>
@@ -802,8 +867,13 @@
       <w:pPr>
         <w:pStyle w:val="31"/>
         <w:tabs>
-          <w:tab w:val="left" w:pos="1929"/>
-        </w:tabs>
+          <w:tab w:val="clear" w:pos="9911"/>
+          <w:tab w:val="clear" w:pos="1100"/>
+          <w:tab w:val="left" w:pos="1134"/>
+          <w:tab w:val="right" w:leader="dot" w:pos="8788"/>
+        </w:tabs>
+        <w:ind w:left="284" w:right="0" w:firstLine="0" w:hanging="0"/>
+        <w:jc w:val="left"/>
       </w:pPr>
       <w:hyperlink w:anchor="_Toc000500013" w:history="1">
         <w:r>
@@ -839,8 +909,13 @@
       <w:pPr>
         <w:pStyle w:val="31"/>
         <w:tabs>
-          <w:tab w:val="left" w:pos="1929"/>
-        </w:tabs>
+          <w:tab w:val="clear" w:pos="9911"/>
+          <w:tab w:val="clear" w:pos="1100"/>
+          <w:tab w:val="left" w:pos="1134"/>
+          <w:tab w:val="right" w:leader="dot" w:pos="8788"/>
+        </w:tabs>
+        <w:ind w:left="284" w:right="0" w:firstLine="0" w:hanging="0"/>
+        <w:jc w:val="left"/>
       </w:pPr>
       <w:hyperlink w:anchor="_Toc000500014" w:history="1">
         <w:r>
@@ -876,8 +951,13 @@
       <w:pPr>
         <w:pStyle w:val="31"/>
         <w:tabs>
-          <w:tab w:val="left" w:pos="1929"/>
-        </w:tabs>
+          <w:tab w:val="clear" w:pos="9911"/>
+          <w:tab w:val="clear" w:pos="1100"/>
+          <w:tab w:val="left" w:pos="1134"/>
+          <w:tab w:val="right" w:leader="dot" w:pos="8788"/>
+        </w:tabs>
+        <w:ind w:left="284" w:right="0" w:firstLine="0" w:hanging="0"/>
+        <w:jc w:val="left"/>
       </w:pPr>
       <w:hyperlink w:anchor="_Toc000500015" w:history="1">
         <w:r>
@@ -913,8 +993,13 @@
       <w:pPr>
         <w:pStyle w:val="21"/>
         <w:tabs>
-          <w:tab w:val="left" w:pos="1440"/>
-        </w:tabs>
+          <w:tab w:val="clear" w:pos="9911"/>
+          <w:tab w:val="clear" w:pos="1100"/>
+          <w:tab w:val="left" w:pos="567"/>
+          <w:tab w:val="right" w:leader="dot" w:pos="8788"/>
+        </w:tabs>
+        <w:ind w:left="0" w:right="0" w:firstLine="0" w:hanging="0"/>
+        <w:jc w:val="left"/>
       </w:pPr>
       <w:hyperlink w:anchor="_Toc000500016" w:history="1">
         <w:r>
@@ -950,8 +1035,13 @@
       <w:pPr>
         <w:pStyle w:val="31"/>
         <w:tabs>
-          <w:tab w:val="left" w:pos="1929"/>
-        </w:tabs>
+          <w:tab w:val="clear" w:pos="9911"/>
+          <w:tab w:val="clear" w:pos="1100"/>
+          <w:tab w:val="left" w:pos="1134"/>
+          <w:tab w:val="right" w:leader="dot" w:pos="8788"/>
+        </w:tabs>
+        <w:ind w:left="284" w:right="0" w:firstLine="0" w:hanging="0"/>
+        <w:jc w:val="left"/>
       </w:pPr>
       <w:hyperlink w:anchor="_Toc000500017" w:history="1">
         <w:r>
@@ -987,8 +1077,13 @@
       <w:pPr>
         <w:pStyle w:val="31"/>
         <w:tabs>
-          <w:tab w:val="left" w:pos="1929"/>
-        </w:tabs>
+          <w:tab w:val="clear" w:pos="9911"/>
+          <w:tab w:val="clear" w:pos="1100"/>
+          <w:tab w:val="left" w:pos="1134"/>
+          <w:tab w:val="right" w:leader="dot" w:pos="8788"/>
+        </w:tabs>
+        <w:ind w:left="284" w:right="0" w:firstLine="0" w:hanging="0"/>
+        <w:jc w:val="left"/>
       </w:pPr>
       <w:hyperlink w:anchor="_Toc000500018" w:history="1">
         <w:r>
@@ -1024,8 +1119,13 @@
       <w:pPr>
         <w:pStyle w:val="21"/>
         <w:tabs>
-          <w:tab w:val="left" w:pos="1440"/>
-        </w:tabs>
+          <w:tab w:val="clear" w:pos="9911"/>
+          <w:tab w:val="clear" w:pos="1100"/>
+          <w:tab w:val="left" w:pos="567"/>
+          <w:tab w:val="right" w:leader="dot" w:pos="8788"/>
+        </w:tabs>
+        <w:ind w:left="0" w:right="0" w:firstLine="0" w:hanging="0"/>
+        <w:jc w:val="left"/>
       </w:pPr>
       <w:hyperlink w:anchor="_Toc000500019" w:history="1">
         <w:r>
@@ -1061,8 +1161,13 @@
       <w:pPr>
         <w:pStyle w:val="31"/>
         <w:tabs>
-          <w:tab w:val="left" w:pos="1929"/>
-        </w:tabs>
+          <w:tab w:val="clear" w:pos="9911"/>
+          <w:tab w:val="clear" w:pos="1100"/>
+          <w:tab w:val="left" w:pos="1134"/>
+          <w:tab w:val="right" w:leader="dot" w:pos="8788"/>
+        </w:tabs>
+        <w:ind w:left="284" w:right="0" w:firstLine="0" w:hanging="0"/>
+        <w:jc w:val="left"/>
       </w:pPr>
       <w:hyperlink w:anchor="_Toc000500020" w:history="1">
         <w:r>
@@ -1098,8 +1203,13 @@
       <w:pPr>
         <w:pStyle w:val="31"/>
         <w:tabs>
-          <w:tab w:val="left" w:pos="1929"/>
-        </w:tabs>
+          <w:tab w:val="clear" w:pos="9911"/>
+          <w:tab w:val="clear" w:pos="1100"/>
+          <w:tab w:val="left" w:pos="1134"/>
+          <w:tab w:val="right" w:leader="dot" w:pos="8788"/>
+        </w:tabs>
+        <w:ind w:left="284" w:right="0" w:firstLine="0" w:hanging="0"/>
+        <w:jc w:val="left"/>
       </w:pPr>
       <w:hyperlink w:anchor="_Toc000500021" w:history="1">
         <w:r>
@@ -1135,8 +1245,13 @@
       <w:pPr>
         <w:pStyle w:val="31"/>
         <w:tabs>
-          <w:tab w:val="left" w:pos="1929"/>
-        </w:tabs>
+          <w:tab w:val="clear" w:pos="9911"/>
+          <w:tab w:val="clear" w:pos="1100"/>
+          <w:tab w:val="left" w:pos="1134"/>
+          <w:tab w:val="right" w:leader="dot" w:pos="8788"/>
+        </w:tabs>
+        <w:ind w:left="284" w:right="0" w:firstLine="0" w:hanging="0"/>
+        <w:jc w:val="left"/>
       </w:pPr>
       <w:hyperlink w:anchor="_Toc000500022" w:history="1">
         <w:r>
@@ -1172,8 +1287,13 @@
       <w:pPr>
         <w:pStyle w:val="21"/>
         <w:tabs>
-          <w:tab w:val="left" w:pos="1440"/>
-        </w:tabs>
+          <w:tab w:val="clear" w:pos="9911"/>
+          <w:tab w:val="clear" w:pos="1100"/>
+          <w:tab w:val="left" w:pos="567"/>
+          <w:tab w:val="right" w:leader="dot" w:pos="8788"/>
+        </w:tabs>
+        <w:ind w:left="0" w:right="0" w:firstLine="0" w:hanging="0"/>
+        <w:jc w:val="left"/>
       </w:pPr>
       <w:hyperlink w:anchor="_Toc000500023" w:history="1">
         <w:r>
@@ -1209,8 +1329,13 @@
       <w:pPr>
         <w:pStyle w:val="31"/>
         <w:tabs>
-          <w:tab w:val="left" w:pos="1929"/>
-        </w:tabs>
+          <w:tab w:val="clear" w:pos="9911"/>
+          <w:tab w:val="clear" w:pos="1100"/>
+          <w:tab w:val="left" w:pos="1134"/>
+          <w:tab w:val="right" w:leader="dot" w:pos="8788"/>
+        </w:tabs>
+        <w:ind w:left="284" w:right="0" w:firstLine="0" w:hanging="0"/>
+        <w:jc w:val="left"/>
       </w:pPr>
       <w:hyperlink w:anchor="_Toc000500024" w:history="1">
         <w:r>
@@ -1246,8 +1371,13 @@
       <w:pPr>
         <w:pStyle w:val="31"/>
         <w:tabs>
-          <w:tab w:val="left" w:pos="1929"/>
-        </w:tabs>
+          <w:tab w:val="clear" w:pos="9911"/>
+          <w:tab w:val="clear" w:pos="1100"/>
+          <w:tab w:val="left" w:pos="1134"/>
+          <w:tab w:val="right" w:leader="dot" w:pos="8788"/>
+        </w:tabs>
+        <w:ind w:left="284" w:right="0" w:firstLine="0" w:hanging="0"/>
+        <w:jc w:val="left"/>
       </w:pPr>
       <w:hyperlink w:anchor="_Toc000500025" w:history="1">
         <w:r>
@@ -1283,8 +1413,13 @@
       <w:pPr>
         <w:pStyle w:val="31"/>
         <w:tabs>
-          <w:tab w:val="left" w:pos="1929"/>
-        </w:tabs>
+          <w:tab w:val="clear" w:pos="9911"/>
+          <w:tab w:val="clear" w:pos="1100"/>
+          <w:tab w:val="left" w:pos="1134"/>
+          <w:tab w:val="right" w:leader="dot" w:pos="8788"/>
+        </w:tabs>
+        <w:ind w:left="284" w:right="0" w:firstLine="0" w:hanging="0"/>
+        <w:jc w:val="left"/>
       </w:pPr>
       <w:hyperlink w:anchor="_Toc000500026" w:history="1">
         <w:r>
@@ -1320,8 +1455,13 @@
       <w:pPr>
         <w:pStyle w:val="31"/>
         <w:tabs>
-          <w:tab w:val="left" w:pos="1929"/>
-        </w:tabs>
+          <w:tab w:val="clear" w:pos="9911"/>
+          <w:tab w:val="clear" w:pos="1100"/>
+          <w:tab w:val="left" w:pos="1134"/>
+          <w:tab w:val="right" w:leader="dot" w:pos="8788"/>
+        </w:tabs>
+        <w:ind w:left="284" w:right="0" w:firstLine="0" w:hanging="0"/>
+        <w:jc w:val="left"/>
       </w:pPr>
       <w:hyperlink w:anchor="_Toc000500027" w:history="1">
         <w:r>
@@ -1357,8 +1497,13 @@
       <w:pPr>
         <w:pStyle w:val="21"/>
         <w:tabs>
-          <w:tab w:val="left" w:pos="1440"/>
-        </w:tabs>
+          <w:tab w:val="clear" w:pos="9911"/>
+          <w:tab w:val="clear" w:pos="1100"/>
+          <w:tab w:val="left" w:pos="567"/>
+          <w:tab w:val="right" w:leader="dot" w:pos="8788"/>
+        </w:tabs>
+        <w:ind w:left="0" w:right="0" w:firstLine="0" w:hanging="0"/>
+        <w:jc w:val="left"/>
       </w:pPr>
       <w:hyperlink w:anchor="_Toc000500028" w:history="1">
         <w:r>
@@ -1394,8 +1539,13 @@
       <w:pPr>
         <w:pStyle w:val="31"/>
         <w:tabs>
-          <w:tab w:val="left" w:pos="1929"/>
-        </w:tabs>
+          <w:tab w:val="clear" w:pos="9911"/>
+          <w:tab w:val="clear" w:pos="1100"/>
+          <w:tab w:val="left" w:pos="1134"/>
+          <w:tab w:val="right" w:leader="dot" w:pos="8788"/>
+        </w:tabs>
+        <w:ind w:left="284" w:right="0" w:firstLine="0" w:hanging="0"/>
+        <w:jc w:val="left"/>
       </w:pPr>
       <w:hyperlink w:anchor="_Toc000500029" w:history="1">
         <w:r>
@@ -1431,8 +1581,13 @@
       <w:pPr>
         <w:pStyle w:val="31"/>
         <w:tabs>
-          <w:tab w:val="left" w:pos="1929"/>
-        </w:tabs>
+          <w:tab w:val="clear" w:pos="9911"/>
+          <w:tab w:val="clear" w:pos="1100"/>
+          <w:tab w:val="left" w:pos="1134"/>
+          <w:tab w:val="right" w:leader="dot" w:pos="8788"/>
+        </w:tabs>
+        <w:ind w:left="284" w:right="0" w:firstLine="0" w:hanging="0"/>
+        <w:jc w:val="left"/>
       </w:pPr>
       <w:hyperlink w:anchor="_Toc000500030" w:history="1">
         <w:r>

</xml_diff>

<commit_message>
docs: make TOC styles of appendix A robust against field refresh
</commit_message>
<xml_diff>
--- a/docs/coursework/Приложение_А_Техническое_задание.docx
+++ b/docs/coursework/Приложение_А_Техническое_задание.docx
@@ -17452,10 +17452,12 @@
     <w:rsid w:val="005074BD"/>
     <w:pPr>
       <w:tabs>
-        <w:tab w:val="right" w:leader="dot" w:pos="9911"/>
+        <w:tab w:val="left" w:pos="567"/>
+        <w:tab w:val="right" w:leader="dot" w:pos="8788"/>
       </w:tabs>
       <w:spacing w:after="100"/>
-      <w:ind w:left="280"/>
+      <w:ind w:left="0" w:firstLine="0"/>
+      <w:jc w:val="left"/>
     </w:pPr>
   </w:style>
   <w:style w:type="character" w:customStyle="1" w:styleId="30">
@@ -17481,11 +17483,12 @@
     <w:rsid w:val="005074BD"/>
     <w:pPr>
       <w:tabs>
-        <w:tab w:val="left" w:pos="1100"/>
-        <w:tab w:val="right" w:leader="dot" w:pos="9911"/>
+        <w:tab w:val="left" w:pos="1134"/>
+        <w:tab w:val="right" w:leader="dot" w:pos="8788"/>
       </w:tabs>
       <w:spacing w:after="100"/>
-      <w:ind w:left="560"/>
+      <w:ind w:left="284" w:firstLine="0"/>
+      <w:jc w:val="left"/>
     </w:pPr>
   </w:style>
   <w:style w:type="character" w:customStyle="1" w:styleId="40">

</xml_diff>